<commit_message>
feat: input C (graf A-J, B->H) - graf_C.txt, test, tangkapan layar, analisis README, slide & naskah
</commit_message>
<xml_diff>
--- a/Docs/Naskah Presentasi Tugas 1 – Shortest Path Dijkstra vs A.docx
+++ b/Docs/Naskah Presentasi Tugas 1 – Shortest Path Dijkstra vs A.docx
@@ -13,13 +13,7 @@
     <w:p>
       <w:pPr/>
       <w:r>
-        <w:t xml:space="preserve">Oct 9, 2026</w:t>
-      </w:r>
-      <w:r>
-        <w:t xml:space="preserve"> · </w:t>
-      </w:r>
-      <w:r>
-        <w:t xml:space="preserve">@Ada Teman</w:t>
+        <w:t xml:space="preserve">Oct 9, 2026 · @Ada Teman</w:t>
       </w:r>
     </w:p>
     <w:p>
@@ -866,6 +860,21 @@
     <w:p>
       <w:pPr/>
       <w:r>
+        <w:rPr>
+          <w:i/>
+        </w:rPr>
+        <w:t xml:space="preserve">[Opsional: klik Buka file graf…, pilih graf_C.txt, lalu klik Bandingkan Dijkstra vs A-Star]</w:t>
+      </w:r>
+    </w:p>
+    <w:p>
+      <w:pPr/>
+      <w:r>
+        <w:t xml:space="preserve">Program yang sama juga membaca graf huruf pada input C tanpa mengubah kode. Hasilnya B, C, F, E, H dengan bobot 9.</w:t>
+      </w:r>
+    </w:p>
+    <w:p>
+      <w:pPr/>
+      <w:r>
         <w:t xml:space="preserve">Untuk analisis hasilnya, saya serahkan kepada [Nama 4].</w:t>
       </w:r>
     </w:p>
@@ -932,6 +941,21 @@
       <w:pPr/>
       <w:r>
         <w:t xml:space="preserve">Program ini juga kami uji dengan input B dan C tanpa mengubah kode sedikit pun. Input B, dari V1 ke V10, menghasilkan jalur V1, V4, V6, V10 dengan bobot 400. Input C, dari B ke H, menghasilkan jalur B, C, F, E, H dengan bobot 9. Keduanya sesuai contoh di soal.</w:t>
+      </w:r>
+    </w:p>
+    <w:p>
+      <w:pPr/>
+      <w:r>
+        <w:rPr>
+          <w:i/>
+        </w:rPr>
+        <w:t xml:space="preserve">[Slide Analisis input C — slide sisipan setelah slide Input B dan C]</w:t>
+      </w:r>
+    </w:p>
+    <w:p>
+      <w:pPr/>
+      <w:r>
+        <w:t xml:space="preserve">Untuk input C, kami tunjukkan prosesnya lebih rinci. Jalur terpendek B, C, F, E, H berbobot 9. Perhatikan sisi C ke E yang berbobot 10. Jalan memutar lewat F hanya 3 ditambah 2, yaitu 5, sehingga jarak E yang semula 11 diperbarui menjadi 6. Dari sisi proses, Dijkstra memperluas 8 dari 10 simpul, sedangkan A-Star 7 simpul. Selisih satu simpul itu adalah G: G dan H sama-sama berjarak 9, dan Dijkstra mengambil G lebih dulu karena urutan masuk antrian. Simpul lain yang diperluas kedua algoritma sama persis. Penyebabnya, bobot sisi terkecil di graf C hanya 1, sehingga heuristik kami sama dengan jumlah langkah dan kurang informatif. Dari sisi waktu, A-Star sekitar dua setengah kali lebih lambat: [sebutkan angka di layar; pada uji di MacBook, tombol Bandingkan menampilkan 9,55 µs untuk Dijkstra dan 22,99 µs untuk A-Star].</w:t>
       </w:r>
     </w:p>
     <w:p>
@@ -1032,7 +1056,7 @@
         </w:numPr>
       </w:pPr>
       <w:r>
-        <w:t xml:space="preserve">☐ Jalankan input B dan C, lalu pastikan hasilnya 400 dan 9 sebelum Pembicara 4 menyebutkannya.</w:t>
+        <w:t xml:space="preserve">☐ Jalankan input B, lalu pastikan hasilnya 400 sebelum Pembicara 4 menyebutkannya. Input C sudah diuji (bobot 9, lihat test_input_C.py); tetap catat angka waktunya dari layar sendiri.</w:t>
       </w:r>
     </w:p>
     <w:p>

</xml_diff>